<commit_message>
Fill DOCX report header details
</commit_message>
<xml_diff>
--- a/public/templates/course-review-template.docx
+++ b/public/templates/course-review-template.docx
@@ -264,43 +264,8 @@
             </w:tcBorders>
           </w:tcPr>
           <w:p>
-            <w:pPr>
-              <w:pStyle w:val="TableParagraph"/>
-              <w:spacing w:before="4"/>
-              <w:ind w:left="107" w:right="3448"/>
-              <w:rPr>
-                <w:b/>
-                <w:sz w:val="16"/>
-              </w:rPr>
-            </w:pPr>
-            <w:r>
-              <w:rPr>
-                <w:b/>
-                <w:sz w:val="16"/>
-              </w:rPr>
-              <w:t>Course Code:</w:t>
-            </w:r>
-            <w:r>
-              <w:rPr>
-                <w:b/>
-                <w:spacing w:val="-52"/>
-                <w:sz w:val="16"/>
-              </w:rPr>
-              <w:t xml:space="preserve"> </w:t>
-            </w:r>
-            <w:r>
-              <w:rPr>
-                <w:b/>
-                <w:sz w:val="16"/>
-              </w:rPr>
-              <w:t>CSS1</w:t>
-            </w:r>
-            <w:r>
-              <w:rPr>
-                <w:b/>
-                <w:sz w:val="16"/>
-              </w:rPr>
-              <w:t>30</w:t>
+            <w:r>
+              <w:t>Course Code: {courseCode}</w:t>
             </w:r>
           </w:p>
         </w:tc>
@@ -313,65 +278,8 @@
             </w:tcBorders>
           </w:tcPr>
           <w:p>
-            <w:pPr>
-              <w:pStyle w:val="TableParagraph"/>
-              <w:spacing w:before="4"/>
-              <w:ind w:left="122" w:right="2851"/>
-              <w:rPr>
-                <w:b/>
-                <w:sz w:val="16"/>
-              </w:rPr>
-            </w:pPr>
-            <w:r>
-              <w:rPr>
-                <w:b/>
-                <w:sz w:val="16"/>
-              </w:rPr>
-              <w:t>Date of Review:</w:t>
-            </w:r>
-            <w:r>
-              <w:rPr>
-                <w:b/>
-                <w:spacing w:val="1"/>
-                <w:sz w:val="16"/>
-              </w:rPr>
-              <w:t xml:space="preserve"> </w:t>
-            </w:r>
-            <w:r>
-              <w:rPr>
-                <w:b/>
-                <w:sz w:val="16"/>
-              </w:rPr>
-              <w:t>May 7</w:t>
-            </w:r>
-            <w:r>
-              <w:rPr>
-                <w:b/>
-                <w:sz w:val="16"/>
-              </w:rPr>
-              <w:t>,</w:t>
-            </w:r>
-            <w:r>
-              <w:rPr>
-                <w:b/>
-                <w:spacing w:val="-4"/>
-                <w:sz w:val="16"/>
-              </w:rPr>
-              <w:t xml:space="preserve"> </w:t>
-            </w:r>
-            <w:r>
-              <w:rPr>
-                <w:b/>
-                <w:sz w:val="16"/>
-              </w:rPr>
-              <w:t>202</w:t>
-            </w:r>
-            <w:r>
-              <w:rPr>
-                <w:b/>
-                <w:sz w:val="16"/>
-              </w:rPr>
-              <w:t>3</w:t>
+            <w:r>
+              <w:t>Date of Review: {dateOfReview}</w:t>
             </w:r>
           </w:p>
         </w:tc>
@@ -390,53 +298,8 @@
             </w:tcBorders>
           </w:tcPr>
           <w:p>
-            <w:pPr>
-              <w:pStyle w:val="TableParagraph"/>
-              <w:spacing w:before="4"/>
-              <w:ind w:left="107"/>
-              <w:rPr>
-                <w:b/>
-                <w:sz w:val="16"/>
-              </w:rPr>
-            </w:pPr>
-            <w:r>
-              <w:rPr>
-                <w:b/>
-                <w:sz w:val="16"/>
-              </w:rPr>
-              <w:t>Course</w:t>
-            </w:r>
-            <w:r>
-              <w:rPr>
-                <w:b/>
-                <w:spacing w:val="-1"/>
-                <w:sz w:val="16"/>
-              </w:rPr>
-              <w:t xml:space="preserve"> </w:t>
-            </w:r>
-            <w:r>
-              <w:rPr>
-                <w:b/>
-                <w:sz w:val="16"/>
-              </w:rPr>
-              <w:t>Title:</w:t>
-            </w:r>
-          </w:p>
-          <w:p>
-            <w:pPr>
-              <w:pStyle w:val="TableParagraph"/>
-              <w:ind w:left="107"/>
-              <w:rPr>
-                <w:b/>
-                <w:sz w:val="16"/>
-              </w:rPr>
-            </w:pPr>
-            <w:r>
-              <w:rPr>
-                <w:b/>
-                <w:sz w:val="16"/>
-              </w:rPr>
-              <w:t>Data Structures and Algorithms</w:t>
+            <w:r>
+              <w:t>Course Title: {courseTitle}</w:t>
             </w:r>
           </w:p>
         </w:tc>
@@ -454,36 +317,8 @@
             </w:tcBorders>
           </w:tcPr>
           <w:p>
-            <w:pPr>
-              <w:pStyle w:val="TableParagraph"/>
-              <w:spacing w:before="2"/>
-              <w:ind w:left="107" w:right="3255"/>
-              <w:rPr>
-                <w:b/>
-                <w:sz w:val="16"/>
-              </w:rPr>
-            </w:pPr>
-            <w:r>
-              <w:rPr>
-                <w:b/>
-                <w:sz w:val="16"/>
-              </w:rPr>
-              <w:t>Academic Year:</w:t>
-            </w:r>
-            <w:r>
-              <w:rPr>
-                <w:b/>
-                <w:spacing w:val="-52"/>
-                <w:sz w:val="16"/>
-              </w:rPr>
-              <w:t xml:space="preserve"> </w:t>
-            </w:r>
-            <w:r>
-              <w:rPr>
-                <w:b/>
-                <w:sz w:val="16"/>
-              </w:rPr>
-              <w:t>2022-23</w:t>
+            <w:r>
+              <w:t>Academic Year: {academicYear}</w:t>
             </w:r>
           </w:p>
         </w:tc>
@@ -496,43 +331,8 @@
             </w:tcBorders>
           </w:tcPr>
           <w:p>
-            <w:pPr>
-              <w:pStyle w:val="TableParagraph"/>
-              <w:spacing w:before="2"/>
-              <w:ind w:left="122" w:right="3857"/>
-              <w:rPr>
-                <w:b/>
-                <w:sz w:val="16"/>
-              </w:rPr>
-            </w:pPr>
-            <w:r>
-              <w:rPr>
-                <w:b/>
-                <w:sz w:val="16"/>
-              </w:rPr>
-              <w:t>Quarter:</w:t>
-            </w:r>
-            <w:r>
-              <w:rPr>
-                <w:b/>
-                <w:spacing w:val="-52"/>
-                <w:sz w:val="16"/>
-              </w:rPr>
-              <w:t xml:space="preserve"> </w:t>
-            </w:r>
-            <w:r>
-              <w:rPr>
-                <w:b/>
-                <w:sz w:val="16"/>
-              </w:rPr>
-              <w:t>3</w:t>
-            </w:r>
-            <w:r>
-              <w:rPr>
-                <w:b/>
-                <w:sz w:val="16"/>
-              </w:rPr>
-              <w:t>Q</w:t>
+            <w:r>
+              <w:t>Quarter: {quarter}</w:t>
             </w:r>
           </w:p>
         </w:tc>

</xml_diff>

<commit_message>
Refine DOCX report details and styling
</commit_message>
<xml_diff>
--- a/public/templates/course-review-template.docx
+++ b/public/templates/course-review-template.docx
@@ -264,7 +264,20 @@
             </w:tcBorders>
           </w:tcPr>
           <w:p>
-            <w:r>
+            <w:pPr>
+              <w:pStyle w:val="TableParagraph"/>
+              <w:spacing w:before="4"/>
+              <w:ind w:left="107" w:right="3448"/>
+              <w:rPr>
+                <w:b/>
+                <w:sz w:val="16"/>
+              </w:rPr>
+            </w:pPr>
+            <w:r>
+              <w:rPr>
+                <w:b/>
+                <w:sz w:val="16"/>
+              </w:rPr>
               <w:t>Course Code: {courseCode}</w:t>
             </w:r>
           </w:p>
@@ -278,7 +291,20 @@
             </w:tcBorders>
           </w:tcPr>
           <w:p>
-            <w:r>
+            <w:pPr>
+              <w:pStyle w:val="TableParagraph"/>
+              <w:spacing w:before="4"/>
+              <w:ind w:left="122" w:right="2851"/>
+              <w:rPr>
+                <w:b/>
+                <w:sz w:val="16"/>
+              </w:rPr>
+            </w:pPr>
+            <w:r>
+              <w:rPr>
+                <w:b/>
+                <w:sz w:val="16"/>
+              </w:rPr>
               <w:t>Date of Review: {dateOfReview}</w:t>
             </w:r>
           </w:p>
@@ -298,7 +324,19 @@
             </w:tcBorders>
           </w:tcPr>
           <w:p>
-            <w:r>
+            <w:pPr>
+              <w:pStyle w:val="TableParagraph"/>
+              <w:ind w:left="107"/>
+              <w:rPr>
+                <w:b/>
+                <w:sz w:val="16"/>
+              </w:rPr>
+            </w:pPr>
+            <w:r>
+              <w:rPr>
+                <w:b/>
+                <w:sz w:val="16"/>
+              </w:rPr>
               <w:t>Course Title: {courseTitle}</w:t>
             </w:r>
           </w:p>
@@ -317,7 +355,20 @@
             </w:tcBorders>
           </w:tcPr>
           <w:p>
-            <w:r>
+            <w:pPr>
+              <w:pStyle w:val="TableParagraph"/>
+              <w:spacing w:before="2"/>
+              <w:ind w:left="107" w:right="3255"/>
+              <w:rPr>
+                <w:b/>
+                <w:sz w:val="16"/>
+              </w:rPr>
+            </w:pPr>
+            <w:r>
+              <w:rPr>
+                <w:b/>
+                <w:sz w:val="16"/>
+              </w:rPr>
               <w:t>Academic Year: {academicYear}</w:t>
             </w:r>
           </w:p>
@@ -331,7 +382,20 @@
             </w:tcBorders>
           </w:tcPr>
           <w:p>
-            <w:r>
+            <w:pPr>
+              <w:pStyle w:val="TableParagraph"/>
+              <w:spacing w:before="2"/>
+              <w:ind w:left="122" w:right="3857"/>
+              <w:rPr>
+                <w:b/>
+                <w:sz w:val="16"/>
+              </w:rPr>
+            </w:pPr>
+            <w:r>
+              <w:rPr>
+                <w:b/>
+                <w:sz w:val="16"/>
+              </w:rPr>
               <w:t>Quarter: {quarter}</w:t>
             </w:r>
           </w:p>
@@ -1230,11 +1294,27 @@
     <w:p>
       <w:pPr>
         <w:pStyle w:val="BodyText"/>
+        <w:rPr>
+          <w:rFonts w:ascii="Tahoma"/>
+          <w:sz w:val="12"/>
+        </w:rPr>
+      </w:pPr>
+      <w:r>
+        <w:rPr>
+          <w:rFonts w:ascii="Tahoma"/>
+          <w:sz w:val="12"/>
+        </w:rPr>
+        <w:t>{#sections}</w:t>
+      </w:r>
+    </w:p>
+    <w:p>
+      <w:pPr>
+        <w:pStyle w:val="BodyText"/>
         <w:spacing w:before="100"/>
         <w:ind w:left="100"/>
       </w:pPr>
       <w:r>
-        <w:t>{#sections}{sectionName}</w:t>
+        <w:t>{sectionName}</w:t>
       </w:r>
     </w:p>
     <w:p>
@@ -1940,9 +2020,22 @@
         <w:tc>
           <w:tcPr>
             <w:tcW w:w="594" w:type="dxa"/>
-          </w:tcPr>
-          <w:p>
-            <w:r>
+            <w:vAlign w:val="center"/>
+          </w:tcPr>
+          <w:p>
+            <w:pPr>
+              <w:pStyle w:val="TableParagraph"/>
+              <w:spacing w:before="137"/>
+              <w:ind w:left="88" w:right="78"/>
+              <w:jc w:val="center"/>
+              <w:rPr>
+                <w:rFonts w:ascii="Calibri"/>
+              </w:rPr>
+            </w:pPr>
+            <w:r>
+              <w:rPr>
+                <w:rFonts w:ascii="Calibri"/>
+              </w:rPr>
               <w:t>{#outcomes}{coCode}</w:t>
             </w:r>
           </w:p>
@@ -1950,9 +2043,23 @@
         <w:tc>
           <w:tcPr>
             <w:tcW w:w="2485" w:type="dxa"/>
-          </w:tcPr>
-          <w:p>
-            <w:r>
+            <w:vAlign w:val="center"/>
+          </w:tcPr>
+          <w:p>
+            <w:pPr>
+              <w:pStyle w:val="TableParagraph"/>
+              <w:spacing w:before="1"/>
+              <w:ind w:left="107" w:right="34"/>
+              <w:rPr>
+                <w:rFonts w:ascii="Arial MT"/>
+                <w:sz w:val="18"/>
+              </w:rPr>
+            </w:pPr>
+            <w:r>
+              <w:rPr>
+                <w:rFonts w:ascii="Arial MT"/>
+                <w:sz w:val="18"/>
+              </w:rPr>
               <w:t/>
             </w:r>
           </w:p>
@@ -1960,9 +2067,23 @@
         <w:tc>
           <w:tcPr>
             <w:tcW w:w="1672" w:type="dxa"/>
-          </w:tcPr>
-          <w:p>
-            <w:r>
+            <w:vAlign w:val="center"/>
+          </w:tcPr>
+          <w:p>
+            <w:pPr>
+              <w:pStyle w:val="TableParagraph"/>
+              <w:ind w:left="389" w:right="380"/>
+              <w:jc w:val="center"/>
+              <w:rPr>
+                <w:rFonts w:ascii="Arial MT"/>
+                <w:sz w:val="16"/>
+              </w:rPr>
+            </w:pPr>
+            <w:r>
+              <w:rPr>
+                <w:rFonts w:ascii="Arial MT"/>
+                <w:sz w:val="16"/>
+              </w:rPr>
               <w:t/>
             </w:r>
           </w:p>
@@ -1970,9 +2091,23 @@
         <w:tc>
           <w:tcPr>
             <w:tcW w:w="1450" w:type="dxa"/>
-          </w:tcPr>
-          <w:p>
-            <w:r>
+            <w:vAlign w:val="center"/>
+          </w:tcPr>
+          <w:p>
+            <w:pPr>
+              <w:pStyle w:val="TableParagraph"/>
+              <w:ind w:left="119" w:right="110"/>
+              <w:jc w:val="center"/>
+              <w:rPr>
+                <w:rFonts w:ascii="Arial MT"/>
+                <w:sz w:val="16"/>
+              </w:rPr>
+            </w:pPr>
+            <w:r>
+              <w:rPr>
+                <w:rFonts w:ascii="Arial MT"/>
+                <w:sz w:val="16"/>
+              </w:rPr>
               <w:t>{assessmentTask}</w:t>
             </w:r>
           </w:p>
@@ -1980,9 +2115,23 @@
         <w:tc>
           <w:tcPr>
             <w:tcW w:w="1772" w:type="dxa"/>
-          </w:tcPr>
-          <w:p>
-            <w:r>
+            <w:vAlign w:val="center"/>
+          </w:tcPr>
+          <w:p>
+            <w:pPr>
+              <w:pStyle w:val="TableParagraph"/>
+              <w:ind w:left="115" w:right="114"/>
+              <w:jc w:val="center"/>
+              <w:rPr>
+                <w:rFonts w:ascii="Arial MT"/>
+                <w:sz w:val="16"/>
+              </w:rPr>
+            </w:pPr>
+            <w:r>
+              <w:rPr>
+                <w:rFonts w:ascii="Arial MT"/>
+                <w:sz w:val="16"/>
+              </w:rPr>
               <w:t>{minSatisfactoryPercent}</w:t>
             </w:r>
           </w:p>
@@ -1990,9 +2139,23 @@
         <w:tc>
           <w:tcPr>
             <w:tcW w:w="1772" w:type="dxa"/>
-          </w:tcPr>
-          <w:p>
-            <w:r>
+            <w:vAlign w:val="center"/>
+          </w:tcPr>
+          <w:p>
+            <w:pPr>
+              <w:pStyle w:val="TableParagraph"/>
+              <w:ind w:left="113" w:right="114"/>
+              <w:jc w:val="center"/>
+              <w:rPr>
+                <w:rFonts w:ascii="Arial MT"/>
+                <w:sz w:val="16"/>
+              </w:rPr>
+            </w:pPr>
+            <w:r>
+              <w:rPr>
+                <w:rFonts w:ascii="Arial MT"/>
+                <w:sz w:val="16"/>
+              </w:rPr>
               <w:t>{targetPassedPercent}</w:t>
             </w:r>
           </w:p>
@@ -2000,9 +2163,23 @@
         <w:tc>
           <w:tcPr>
             <w:tcW w:w="731" w:type="dxa"/>
-          </w:tcPr>
-          <w:p>
-            <w:r>
+            <w:vAlign w:val="center"/>
+          </w:tcPr>
+          <w:p>
+            <w:pPr>
+              <w:pStyle w:val="TableParagraph"/>
+              <w:ind w:right="3"/>
+              <w:jc w:val="center"/>
+              <w:rPr>
+                <w:rFonts w:ascii="Arial MT"/>
+                <w:sz w:val="16"/>
+              </w:rPr>
+            </w:pPr>
+            <w:r>
+              <w:rPr>
+                <w:rFonts w:ascii="Arial MT"/>
+                <w:sz w:val="16"/>
+              </w:rPr>
               <w:t>{frequencyPassed}</w:t>
             </w:r>
           </w:p>
@@ -2010,9 +2187,23 @@
         <w:tc>
           <w:tcPr>
             <w:tcW w:w="790" w:type="dxa"/>
-          </w:tcPr>
-          <w:p>
-            <w:r>
+            <w:vAlign w:val="center"/>
+          </w:tcPr>
+          <w:p>
+            <w:pPr>
+              <w:pStyle w:val="TableParagraph"/>
+              <w:ind w:left="120" w:right="124"/>
+              <w:jc w:val="center"/>
+              <w:rPr>
+                <w:rFonts w:ascii="Arial MT"/>
+                <w:sz w:val="16"/>
+              </w:rPr>
+            </w:pPr>
+            <w:r>
+              <w:rPr>
+                <w:rFonts w:ascii="Arial MT"/>
+                <w:sz w:val="16"/>
+              </w:rPr>
               <w:t>{percentagePassed}</w:t>
             </w:r>
           </w:p>
@@ -2020,9 +2211,24 @@
         <w:tc>
           <w:tcPr>
             <w:tcW w:w="926" w:type="dxa"/>
-          </w:tcPr>
-          <w:p>
-            <w:r>
+            <w:vAlign w:val="center"/>
+          </w:tcPr>
+          <w:p>
+            <w:pPr>
+              <w:pStyle w:val="TableParagraph"/>
+              <w:spacing w:before="137"/>
+              <w:ind w:left="77" w:right="89"/>
+              <w:jc w:val="center"/>
+              <w:rPr>
+                <w:rFonts w:ascii="Calibri"/>
+                <w:b/>
+              </w:rPr>
+            </w:pPr>
+            <w:r>
+              <w:rPr>
+                <w:rFonts w:ascii="Calibri"/>
+                <w:b/>
+              </w:rPr>
               <w:t>{remarks}</w:t>
             </w:r>
           </w:p>
@@ -2030,9 +2236,23 @@
         <w:tc>
           <w:tcPr>
             <w:tcW w:w="1823" w:type="dxa"/>
-          </w:tcPr>
-          <w:p>
-            <w:r>
+            <w:vAlign w:val="center"/>
+          </w:tcPr>
+          <w:p>
+            <w:pPr>
+              <w:pStyle w:val="TableParagraph"/>
+              <w:spacing w:before="1"/>
+              <w:ind w:left="96"/>
+              <w:rPr>
+                <w:rFonts w:ascii="Times New Roman"/>
+                <w:sz w:val="16"/>
+              </w:rPr>
+            </w:pPr>
+            <w:r>
+              <w:rPr>
+                <w:rFonts w:ascii="Times New Roman"/>
+                <w:sz w:val="16"/>
+              </w:rPr>
               <w:t>{recommendation}{/outcomes}</w:t>
             </w:r>
           </w:p>
@@ -2047,6 +2267,10 @@
         </w:rPr>
       </w:pPr>
       <w:r>
+        <w:rPr>
+          <w:rFonts w:ascii="Times New Roman"/>
+          <w:sz w:val="16"/>
+        </w:rPr>
         <w:t>{/sections}</w:t>
       </w:r>
     </w:p>

</xml_diff>

<commit_message>
Clear sample names from DOCX template
</commit_message>
<xml_diff>
--- a/public/templates/course-review-template.docx
+++ b/public/templates/course-review-template.docx
@@ -640,7 +640,7 @@
                 <w:b/>
                 <w:sz w:val="20"/>
               </w:rPr>
-              <w:t>John Paul Tomas</w:t>
+              <w:t/>
             </w:r>
           </w:p>
         </w:tc>
@@ -748,7 +748,7 @@
                 <w:b/>
                 <w:sz w:val="20"/>
               </w:rPr>
-              <w:t>Joel De Goma</w:t>
+              <w:t/>
             </w:r>
           </w:p>
         </w:tc>
@@ -943,7 +943,7 @@
                 <w:b/>
                 <w:sz w:val="20"/>
               </w:rPr>
-              <w:t>Gloren</w:t>
+              <w:t/>
             </w:r>
             <w:r>
               <w:rPr>
@@ -958,7 +958,7 @@
                 <w:b/>
                 <w:sz w:val="20"/>
               </w:rPr>
-              <w:t>S.</w:t>
+              <w:t/>
             </w:r>
             <w:r>
               <w:rPr>
@@ -973,7 +973,7 @@
                 <w:b/>
                 <w:sz w:val="20"/>
               </w:rPr>
-              <w:t>Fuentes</w:t>
+              <w:t/>
             </w:r>
           </w:p>
         </w:tc>

</xml_diff>